<commit_message>
Updated the syllabus etc
</commit_message>
<xml_diff>
--- a/worksheet/02_explanation.docx
+++ b/worksheet/02_explanation.docx
@@ -14,7 +14,14 @@
           <w:rFonts w:hint="eastAsia"/>
           <w:lang w:val="en-US"/>
         </w:rPr>
-        <w:t>学籍番号：</w:t>
+        <w:t>学生</w:t>
+      </w:r>
+      <w:r>
+        <w:rPr>
+          <w:rFonts w:hint="eastAsia"/>
+          <w:lang w:val="en-US"/>
+        </w:rPr>
+        <w:t>番号：</w:t>
       </w:r>
       <w:r>
         <w:rPr>
@@ -184,7 +191,6 @@
         <w:pStyle w:val="a9"/>
         <w:ind w:left="440"/>
         <w:rPr>
-          <w:rFonts w:hint="eastAsia"/>
           <w:lang w:val="en-US"/>
         </w:rPr>
       </w:pPr>
@@ -203,7 +209,6 @@
         <w:pStyle w:val="a9"/>
         <w:ind w:left="440"/>
         <w:rPr>
-          <w:rFonts w:hint="eastAsia"/>
           <w:lang w:val="en-US"/>
         </w:rPr>
       </w:pPr>
@@ -230,9 +235,6 @@
       <w:pPr>
         <w:pStyle w:val="a9"/>
         <w:ind w:left="440"/>
-        <w:rPr>
-          <w:rFonts w:hint="eastAsia"/>
-        </w:rPr>
       </w:pPr>
     </w:p>
     <w:p>
@@ -284,9 +286,6 @@
       <w:pPr>
         <w:pStyle w:val="a9"/>
         <w:ind w:left="440"/>
-        <w:rPr>
-          <w:rFonts w:hint="eastAsia"/>
-        </w:rPr>
       </w:pPr>
       <w:r>
         <w:rPr>
@@ -326,9 +325,6 @@
       <w:pPr>
         <w:pStyle w:val="a9"/>
         <w:ind w:left="440"/>
-        <w:rPr>
-          <w:rFonts w:hint="eastAsia"/>
-        </w:rPr>
       </w:pPr>
     </w:p>
     <w:p>
@@ -347,20 +343,11 @@
     <w:p/>
     <w:p/>
     <w:p/>
-    <w:p>
-      <w:pPr>
-        <w:rPr>
-          <w:rFonts w:hint="eastAsia"/>
-        </w:rPr>
-      </w:pPr>
-    </w:p>
+    <w:p/>
     <w:p>
       <w:pPr>
         <w:widowControl/>
         <w:jc w:val="left"/>
-        <w:rPr>
-          <w:rFonts w:hint="eastAsia"/>
-        </w:rPr>
       </w:pPr>
       <w:r>
         <w:br w:type="page"/>
@@ -368,6 +355,14 @@
     </w:p>
     <w:p>
       <w:pPr>
+        <w:rPr>
+          <w:b/>
+          <w:bCs/>
+          <w:sz w:val="24"/>
+          <w:szCs w:val="32"/>
+        </w:rPr>
+      </w:pPr>
+      <w:r>
         <w:rPr>
           <w:rFonts w:hint="eastAsia"/>
           <w:b/>
@@ -375,39 +370,8 @@
           <w:sz w:val="24"/>
           <w:szCs w:val="32"/>
         </w:rPr>
-      </w:pPr>
-      <w:r>
-        <w:rPr>
-          <w:rFonts w:hint="eastAsia"/>
-          <w:b/>
-          <w:bCs/>
-          <w:sz w:val="24"/>
-          <w:szCs w:val="32"/>
-        </w:rPr>
         <w:lastRenderedPageBreak/>
         <w:t>ワーク②：因果関係の検討</w:t>
-      </w:r>
-    </w:p>
-    <w:p/>
-    <w:p>
-      <w:pPr>
-        <w:rPr>
-          <w:rFonts w:hint="eastAsia"/>
-        </w:rPr>
-      </w:pPr>
-      <w:r>
-        <w:rPr>
-          <w:rFonts w:hint="eastAsia"/>
-        </w:rPr>
-        <w:t>チェック者氏名：</w:t>
-      </w:r>
-      <w:r>
-        <w:rPr>
-          <w:rFonts w:hint="eastAsia"/>
-          <w:u w:val="single"/>
-          <w:lang w:val="en-US"/>
-        </w:rPr>
-        <w:t xml:space="preserve">　　　　　　　　　　　　　　</w:t>
       </w:r>
     </w:p>
     <w:p>
@@ -485,22 +449,20 @@
     <w:p>
       <w:pPr>
         <w:rPr>
-          <w:rFonts w:hint="eastAsia"/>
-          <w:lang w:val="en-US"/>
-        </w:rPr>
-      </w:pPr>
-    </w:p>
-    <w:p>
-      <w:pPr>
-        <w:rPr>
-          <w:lang w:val="en-US"/>
-        </w:rPr>
-      </w:pPr>
-    </w:p>
-    <w:p>
-      <w:pPr>
-        <w:rPr>
-          <w:rFonts w:hint="eastAsia"/>
+          <w:lang w:val="en-US"/>
+        </w:rPr>
+      </w:pPr>
+    </w:p>
+    <w:p>
+      <w:pPr>
+        <w:rPr>
+          <w:lang w:val="en-US"/>
+        </w:rPr>
+      </w:pPr>
+    </w:p>
+    <w:p>
+      <w:pPr>
+        <w:rPr>
           <w:lang w:val="en-US"/>
         </w:rPr>
       </w:pPr>
@@ -561,30 +523,27 @@
     <w:p>
       <w:pPr>
         <w:rPr>
-          <w:rFonts w:hint="eastAsia"/>
-          <w:lang w:val="en-US"/>
-        </w:rPr>
-      </w:pPr>
-    </w:p>
-    <w:p>
-      <w:pPr>
-        <w:rPr>
-          <w:lang w:val="en-US"/>
-        </w:rPr>
-      </w:pPr>
-    </w:p>
-    <w:p>
-      <w:pPr>
-        <w:rPr>
-          <w:rFonts w:hint="eastAsia"/>
-          <w:lang w:val="en-US"/>
-        </w:rPr>
-      </w:pPr>
-    </w:p>
-    <w:p>
-      <w:pPr>
-        <w:rPr>
-          <w:rFonts w:hint="eastAsia"/>
+          <w:lang w:val="en-US"/>
+        </w:rPr>
+      </w:pPr>
+    </w:p>
+    <w:p>
+      <w:pPr>
+        <w:rPr>
+          <w:lang w:val="en-US"/>
+        </w:rPr>
+      </w:pPr>
+    </w:p>
+    <w:p>
+      <w:pPr>
+        <w:rPr>
+          <w:lang w:val="en-US"/>
+        </w:rPr>
+      </w:pPr>
+    </w:p>
+    <w:p>
+      <w:pPr>
+        <w:rPr>
           <w:lang w:val="en-US"/>
         </w:rPr>
       </w:pPr>
@@ -610,51 +569,48 @@
     <w:p>
       <w:pPr>
         <w:rPr>
-          <w:rFonts w:hint="eastAsia"/>
-          <w:lang w:val="en-US"/>
-        </w:rPr>
-      </w:pPr>
-    </w:p>
-    <w:p>
-      <w:pPr>
-        <w:rPr>
-          <w:lang w:val="en-US"/>
-        </w:rPr>
-      </w:pPr>
-    </w:p>
-    <w:p>
-      <w:pPr>
-        <w:rPr>
-          <w:lang w:val="en-US"/>
-        </w:rPr>
-      </w:pPr>
-    </w:p>
-    <w:p>
-      <w:pPr>
-        <w:rPr>
-          <w:rFonts w:hint="eastAsia"/>
-          <w:lang w:val="en-US"/>
-        </w:rPr>
-      </w:pPr>
-    </w:p>
-    <w:p>
-      <w:pPr>
-        <w:rPr>
-          <w:lang w:val="en-US"/>
-        </w:rPr>
-      </w:pPr>
-    </w:p>
-    <w:p>
-      <w:pPr>
-        <w:rPr>
-          <w:lang w:val="en-US"/>
-        </w:rPr>
-      </w:pPr>
-    </w:p>
-    <w:p>
-      <w:pPr>
-        <w:rPr>
-          <w:rFonts w:hint="eastAsia"/>
+          <w:lang w:val="en-US"/>
+        </w:rPr>
+      </w:pPr>
+    </w:p>
+    <w:p>
+      <w:pPr>
+        <w:rPr>
+          <w:lang w:val="en-US"/>
+        </w:rPr>
+      </w:pPr>
+    </w:p>
+    <w:p>
+      <w:pPr>
+        <w:rPr>
+          <w:lang w:val="en-US"/>
+        </w:rPr>
+      </w:pPr>
+    </w:p>
+    <w:p>
+      <w:pPr>
+        <w:rPr>
+          <w:lang w:val="en-US"/>
+        </w:rPr>
+      </w:pPr>
+    </w:p>
+    <w:p>
+      <w:pPr>
+        <w:rPr>
+          <w:lang w:val="en-US"/>
+        </w:rPr>
+      </w:pPr>
+    </w:p>
+    <w:p>
+      <w:pPr>
+        <w:rPr>
+          <w:lang w:val="en-US"/>
+        </w:rPr>
+      </w:pPr>
+    </w:p>
+    <w:p>
+      <w:pPr>
+        <w:rPr>
           <w:lang w:val="en-US"/>
         </w:rPr>
       </w:pPr>
@@ -2304,6 +2260,7 @@
   <w:style w:type="character" w:default="1" w:styleId="a0">
     <w:name w:val="Default Paragraph Font"/>
     <w:uiPriority w:val="1"/>
+    <w:semiHidden/>
     <w:unhideWhenUsed/>
   </w:style>
   <w:style w:type="table" w:default="1" w:styleId="a1">

</xml_diff>